<commit_message>
docs(bab2): landasan teori beserta generator docx dari markdown
- BAB 2 memuat 12 subbab: sistem informasi dan REST API, arsitektur terpisah
  dan pola BFF, Laravel dan Eloquent, Next.js/React/Tailwind CSS, autentikasi
  dan otorisasi, basis data relasional, agregasi berbasis feed RSS, penyaringan
  wilayah, kecerdasan buatan generatif, pengujian perangkat lunak, perangkat
  lunak pendukung, serta kerangka pemikiran.
- 16 rujukan; 14 di antaranya ber-DOI dan judulnya sudah dicocokkan dengan
  metadata CrossRef, tiga di antaranya rujukan baru (Middleton dkk. 2018,
  Feng dkk. 2021, Stockem Novo dan Gedikli 2023).
- gen_bab2.py membangun docx (Times New Roman 12, spasi 1,5, margin 4/4/3/3 cm)
  langsung dari markdown sehingga hanya ada satu sumber konten.
- Perbaiki ejaan "Ciayumajakuning" pada BAB 1 dan rujukan [5]; DOI
  10.32534/int.v15i2.6040 memakai ejaan tersebut.
</commit_message>
<xml_diff>
--- a/docs/BAB 1 - TANGSEL LIA.docx
+++ b/docs/BAB 1 - TANGSEL LIA.docx
@@ -2133,7 +2133,7 @@
           <w:i/>
           <w:sz w:val="24"/>
         </w:rPr>
-        <w:t>4. Sistem Informasi Pencarian Lowongan Kerja di Area Ciayumajukinung Berbasis Website</w:t>
+        <w:t>4. Sistem Informasi Pencarian Lowongan Kerja di Area Ciayumajakuning Berbasis Website</w:t>
       </w:r>
     </w:p>
     <w:tbl>
@@ -2376,7 +2376,7 @@
                 <w:i w:val="0"/>
                 <w:sz w:val="22"/>
               </w:rPr>
-              <w:t>Penelitian membangun sistem informasi pencarian lowongan kerja berbasis website untuk Area Ciayumajukinung. Hasilnya menunjukkan bahwa penghimpunan lowongan dari job board nasional ke dalam satu portal memerlukan penyaringan berdasarkan wilayah secara eksplisit, karena tawaran dari luar area tetap muncul pada hasil pencarian dan harus disaring secara manual.</w:t>
+              <w:t>Penelitian membangun sistem informasi pencarian lowongan kerja berbasis website untuk Area Ciayumajakuning. Hasilnya menunjukkan bahwa penghimpunan lowongan dari job board nasional ke dalam satu portal memerlukan penyaringan berdasarkan wilayah secara eksplisit, karena tawaran dari luar area tetap muncul pada hasil pencarian dan harus disaring secara manual.</w:t>
             </w:r>
           </w:p>
         </w:tc>
@@ -3722,7 +3722,7 @@
           <w:i w:val="0"/>
           <w:sz w:val="24"/>
         </w:rPr>
-        <w:t xml:space="preserve">D. Novianti, F. Wicaksono, and M. R. Soemarsono, “Sistem Informasi Pencarian Lowongan Kerja di Area Ciayumajukinung Berbasis Website,” </w:t>
+        <w:t xml:space="preserve">D. Novianti, F. Wicaksono, and M. R. Soemarsono, “Sistem Informasi Pencarian Lowongan Kerja di Area Ciayumajakuning Berbasis Website,” </w:t>
       </w:r>
       <w:r>
         <w:rPr>

</xml_diff>